<commit_message>
El delay lo leen los clientes al conectarse a la red en la variable AUTO_OFF_DELAY del master
</commit_message>
<xml_diff>
--- a/seniales_wifi_v1/Señales Wifi v1.docx
+++ b/seniales_wifi_v1/Señales Wifi v1.docx
@@ -28,7 +28,13 @@
         <w:pStyle w:val="NormalWeb"/>
       </w:pPr>
       <w:r>
-        <w:t xml:space="preserve">genera el diagrama de conexion con la tira led para el </w:t>
+        <w:t xml:space="preserve">genera el diagrama de conexion con </w:t>
+      </w:r>
+      <w:r>
+        <w:t>el foco</w:t>
+      </w:r>
+      <w:r>
+        <w:t xml:space="preserve"> para el </w:t>
       </w:r>
       <w:r>
         <w:rPr>
@@ -44,6 +50,30 @@
           <w:lang w:val="es-ES_tradnl"/>
         </w:rPr>
       </w:pPr>
+      <w:r>
+        <w:rPr>
+          <w:lang w:val="es-ES_tradnl"/>
+        </w:rPr>
+        <w:t xml:space="preserve">Ajusta el proyecto para que </w:t>
+      </w:r>
+      <w:r>
+        <w:rPr>
+          <w:lang w:val="es-ES_tradnl"/>
+        </w:rPr>
+        <w:t xml:space="preserve">el cliente lea la configuración de </w:t>
+      </w:r>
+      <w:r>
+        <w:rPr>
+          <w:lang w:val="es-ES_tradnl"/>
+        </w:rPr>
+        <w:t>AUTO_OFF_DELAY</w:t>
+      </w:r>
+      <w:r>
+        <w:rPr>
+          <w:lang w:val="es-ES_tradnl"/>
+        </w:rPr>
+        <w:t xml:space="preserve"> del master al conectarse a la red, en el master declara una variable para poder cambiar el tiempo solo en el master y los clientes lean esa configuración</w:t>
+      </w:r>
     </w:p>
     <w:sectPr>
       <w:pgSz w:w="12240" w:h="15840"/>

</xml_diff>

<commit_message>
Configuracion de led del modulo para indicar cuando hay error, cuando no hay sexal, cuando no encuentra la red, y cuando se conecta
</commit_message>
<xml_diff>
--- a/seniales_wifi_v1/Señales Wifi v1.docx
+++ b/seniales_wifi_v1/Señales Wifi v1.docx
@@ -72,8 +72,112 @@
         <w:rPr>
           <w:lang w:val="es-ES_tradnl"/>
         </w:rPr>
-        <w:t xml:space="preserve"> del master al conectarse a la red, en el master declara una variable para poder cambiar el tiempo solo en el master y los clientes lean esa configuración</w:t>
-      </w:r>
+        <w:t xml:space="preserve"> del </w:t>
+      </w:r>
+      <w:proofErr w:type="gramStart"/>
+      <w:r>
+        <w:rPr>
+          <w:lang w:val="es-ES_tradnl"/>
+        </w:rPr>
+        <w:t>master</w:t>
+      </w:r>
+      <w:proofErr w:type="gramEnd"/>
+      <w:r>
+        <w:rPr>
+          <w:lang w:val="es-ES_tradnl"/>
+        </w:rPr>
+        <w:t xml:space="preserve"> al conectarse a la red, en el </w:t>
+      </w:r>
+      <w:proofErr w:type="gramStart"/>
+      <w:r>
+        <w:rPr>
+          <w:lang w:val="es-ES_tradnl"/>
+        </w:rPr>
+        <w:t>master</w:t>
+      </w:r>
+      <w:proofErr w:type="gramEnd"/>
+      <w:r>
+        <w:rPr>
+          <w:lang w:val="es-ES_tradnl"/>
+        </w:rPr>
+        <w:t xml:space="preserve"> declara una variable para poder cambiar el tiempo solo en el </w:t>
+      </w:r>
+      <w:proofErr w:type="gramStart"/>
+      <w:r>
+        <w:rPr>
+          <w:lang w:val="es-ES_tradnl"/>
+        </w:rPr>
+        <w:t>master</w:t>
+      </w:r>
+      <w:proofErr w:type="gramEnd"/>
+      <w:r>
+        <w:rPr>
+          <w:lang w:val="es-ES_tradnl"/>
+        </w:rPr>
+        <w:t xml:space="preserve"> y los clientes lean esa configuración</w:t>
+      </w:r>
+    </w:p>
+    <w:p>
+      <w:pPr>
+        <w:rPr>
+          <w:lang w:val="es-ES_tradnl"/>
+        </w:rPr>
+      </w:pPr>
+    </w:p>
+    <w:p>
+      <w:pPr>
+        <w:rPr>
+          <w:lang w:val="es-ES_tradnl"/>
+        </w:rPr>
+      </w:pPr>
+      <w:r>
+        <w:rPr>
+          <w:lang w:val="es-ES_tradnl"/>
+        </w:rPr>
+        <w:t xml:space="preserve">Modifica el cliente para que el led del </w:t>
+      </w:r>
+      <w:proofErr w:type="spellStart"/>
+      <w:r>
+        <w:rPr>
+          <w:lang w:val="es-ES_tradnl"/>
+        </w:rPr>
+        <w:t>modulo</w:t>
+      </w:r>
+      <w:proofErr w:type="spellEnd"/>
+      <w:r>
+        <w:rPr>
+          <w:lang w:val="es-ES_tradnl"/>
+        </w:rPr>
+        <w:t xml:space="preserve"> </w:t>
+      </w:r>
+      <w:r>
+        <w:rPr>
+          <w:lang w:val="es-ES_tradnl"/>
+        </w:rPr>
+        <w:t xml:space="preserve">parpadee mientras </w:t>
+      </w:r>
+      <w:proofErr w:type="spellStart"/>
+      <w:r>
+        <w:rPr>
+          <w:lang w:val="es-ES_tradnl"/>
+        </w:rPr>
+        <w:t>esta</w:t>
+      </w:r>
+      <w:proofErr w:type="spellEnd"/>
+      <w:r>
+        <w:rPr>
+          <w:lang w:val="es-ES_tradnl"/>
+        </w:rPr>
+        <w:t xml:space="preserve"> buscando la señal de la red y mientras hace la </w:t>
+      </w:r>
+      <w:proofErr w:type="spellStart"/>
+      <w:r>
+        <w:rPr>
+          <w:lang w:val="es-ES_tradnl"/>
+        </w:rPr>
+        <w:t>conexion</w:t>
+      </w:r>
+      <w:proofErr w:type="spellEnd"/>
     </w:p>
     <w:sectPr>
       <w:pgSz w:w="12240" w:h="15840"/>

</xml_diff>

<commit_message>
control remoto simplificado pero todavia tiene errores, la primera vez funciona perfecto, despues ya no hasta la tercera
</commit_message>
<xml_diff>
--- a/seniales_wifi_v1/Señales Wifi v1.docx
+++ b/seniales_wifi_v1/Señales Wifi v1.docx
@@ -202,6 +202,169 @@
         </w:rPr>
         <w:t xml:space="preserve"> cada que se presione un botón, prenda un led simple y se apague después de 3 segundos</w:t>
       </w:r>
+    </w:p>
+    <w:p>
+      <w:pPr>
+        <w:rPr>
+          <w:lang w:val="es-ES_tradnl"/>
+        </w:rPr>
+      </w:pPr>
+      <w:r>
+        <w:rPr>
+          <w:lang w:val="es-ES_tradnl"/>
+        </w:rPr>
+        <w:t xml:space="preserve">Ajusta la funcionalidad del </w:t>
+      </w:r>
+      <w:proofErr w:type="spellStart"/>
+      <w:r>
+        <w:rPr>
+          <w:lang w:val="es-ES_tradnl"/>
+        </w:rPr>
+        <w:t>arduino</w:t>
+      </w:r>
+      <w:proofErr w:type="spellEnd"/>
+      <w:r>
+        <w:rPr>
+          <w:lang w:val="es-ES_tradnl"/>
+        </w:rPr>
+        <w:t xml:space="preserve"> cliente para que la conexión al maestro sea similar a la de los </w:t>
+      </w:r>
+      <w:proofErr w:type="spellStart"/>
+      <w:r>
+        <w:rPr>
+          <w:lang w:val="es-ES_tradnl"/>
+        </w:rPr>
+        <w:t>modulos</w:t>
+      </w:r>
+      <w:proofErr w:type="spellEnd"/>
+      <w:r>
+        <w:rPr>
+          <w:lang w:val="es-ES_tradnl"/>
+        </w:rPr>
+        <w:t xml:space="preserve"> del </w:t>
+      </w:r>
+      <w:proofErr w:type="spellStart"/>
+      <w:r>
+        <w:rPr>
+          <w:lang w:val="es-ES_tradnl"/>
+        </w:rPr>
+        <w:t>prioyecto</w:t>
+      </w:r>
+      <w:proofErr w:type="spellEnd"/>
+    </w:p>
+    <w:p>
+      <w:pPr>
+        <w:rPr>
+          <w:lang w:val="es-ES_tradnl"/>
+        </w:rPr>
+      </w:pPr>
+    </w:p>
+    <w:p>
+      <w:pPr>
+        <w:pStyle w:val="NormalWeb"/>
+      </w:pPr>
+      <w:r>
+        <w:t xml:space="preserve">Simplifica y </w:t>
+      </w:r>
+      <w:r>
+        <w:t xml:space="preserve">ajusta la configuracion del </w:t>
+      </w:r>
+      <w:r>
+        <w:t>controlador remoto</w:t>
+      </w:r>
+      <w:r>
+        <w:t xml:space="preserve"> para que se conecte al maestro de forma automatica, la conexion debe ser similar a la de los modulos </w:t>
+      </w:r>
+      <w:r>
+        <w:t>ESP8266-01S</w:t>
+      </w:r>
+      <w:r>
+        <w:t xml:space="preserve"> </w:t>
+      </w:r>
+      <w:r>
+        <w:t>del proyecto</w:t>
+      </w:r>
+      <w:r>
+        <w:t xml:space="preserve">, </w:t>
+      </w:r>
+      <w:r>
+        <w:rPr>
+          <w:lang w:val="es-ES_tradnl"/>
+        </w:rPr>
+        <w:t>, no necesito recibir respuesta del maestro</w:t>
+      </w:r>
+    </w:p>
+    <w:p>
+      <w:pPr>
+        <w:rPr>
+          <w:lang w:val="es-ES_tradnl"/>
+        </w:rPr>
+      </w:pPr>
+      <w:r>
+        <w:rPr>
+          <w:lang w:val="es-ES_tradnl"/>
+        </w:rPr>
+        <w:t xml:space="preserve">Te comparto mi código actual, </w:t>
+      </w:r>
+      <w:r>
+        <w:rPr>
+          <w:lang w:val="es-ES_tradnl"/>
+        </w:rPr>
+        <w:t>simplifica el funcionamiento</w:t>
+      </w:r>
+      <w:r>
+        <w:rPr>
+          <w:lang w:val="es-ES_tradnl"/>
+        </w:rPr>
+        <w:t xml:space="preserve"> del control remoto</w:t>
+      </w:r>
+      <w:r>
+        <w:rPr>
+          <w:lang w:val="es-ES_tradnl"/>
+        </w:rPr>
+        <w:t xml:space="preserve">, no necesito </w:t>
+      </w:r>
+      <w:r>
+        <w:rPr>
+          <w:lang w:val="es-ES_tradnl"/>
+        </w:rPr>
+        <w:t xml:space="preserve">recibir respuesta del maestro, necesito que los focos </w:t>
+      </w:r>
+      <w:proofErr w:type="spellStart"/>
+      <w:r>
+        <w:rPr>
+          <w:lang w:val="es-ES_tradnl"/>
+        </w:rPr>
+        <w:t>selecionados</w:t>
+      </w:r>
+      <w:proofErr w:type="spellEnd"/>
+      <w:r>
+        <w:rPr>
+          <w:lang w:val="es-ES_tradnl"/>
+        </w:rPr>
+        <w:t xml:space="preserve"> prendan lo </w:t>
+      </w:r>
+      <w:proofErr w:type="spellStart"/>
+      <w:r>
+        <w:rPr>
+          <w:lang w:val="es-ES_tradnl"/>
+        </w:rPr>
+        <w:t>mas</w:t>
+      </w:r>
+      <w:proofErr w:type="spellEnd"/>
+      <w:r>
+        <w:rPr>
+          <w:lang w:val="es-ES_tradnl"/>
+        </w:rPr>
+        <w:t xml:space="preserve"> rápido posible</w:t>
+      </w:r>
+    </w:p>
+    <w:p>
+      <w:pPr>
+        <w:rPr>
+          <w:lang w:val="es-ES_tradnl"/>
+        </w:rPr>
+      </w:pPr>
     </w:p>
     <w:sectPr>
       <w:pgSz w:w="12240" w:h="15840"/>

</xml_diff>

<commit_message>
FUNCIONA OK con un sensor jajajaja
</commit_message>
<xml_diff>
--- a/seniales_wifi_v1/Señales Wifi v1.docx
+++ b/seniales_wifi_v1/Señales Wifi v1.docx
@@ -357,6 +357,80 @@
           <w:lang w:val="es-ES_tradnl"/>
         </w:rPr>
         <w:t xml:space="preserve"> rápido posible</w:t>
+      </w:r>
+    </w:p>
+    <w:p>
+      <w:pPr>
+        <w:rPr>
+          <w:lang w:val="es-ES_tradnl"/>
+        </w:rPr>
+      </w:pPr>
+    </w:p>
+    <w:p>
+      <w:pPr>
+        <w:rPr>
+          <w:lang w:val="es-ES_tradnl"/>
+        </w:rPr>
+      </w:pPr>
+      <w:r>
+        <w:rPr>
+          <w:lang w:val="es-ES_tradnl"/>
+        </w:rPr>
+        <w:t xml:space="preserve">Agrega </w:t>
+      </w:r>
+      <w:r>
+        <w:rPr>
+          <w:lang w:val="es-ES_tradnl"/>
+        </w:rPr>
+        <w:t xml:space="preserve">otros 3  </w:t>
+      </w:r>
+      <w:proofErr w:type="spellStart"/>
+      <w:r>
+        <w:rPr>
+          <w:lang w:val="es-ES_tradnl"/>
+        </w:rPr>
+        <w:t>modulos</w:t>
+      </w:r>
+      <w:proofErr w:type="spellEnd"/>
+      <w:r>
+        <w:rPr>
+          <w:lang w:val="es-ES_tradnl"/>
+        </w:rPr>
+        <w:t xml:space="preserve"> de botones extra como el de “</w:t>
+      </w:r>
+      <w:proofErr w:type="spellStart"/>
+      <w:r>
+        <w:rPr>
+          <w:lang w:val="es-ES_tradnl"/>
+        </w:rPr>
+        <w:t>const</w:t>
+      </w:r>
+      <w:proofErr w:type="spellEnd"/>
+      <w:r>
+        <w:rPr>
+          <w:lang w:val="es-ES_tradnl"/>
+        </w:rPr>
+        <w:t xml:space="preserve"> </w:t>
+      </w:r>
+      <w:proofErr w:type="spellStart"/>
+      <w:r>
+        <w:rPr>
+          <w:lang w:val="es-ES_tradnl"/>
+        </w:rPr>
+        <w:t>int</w:t>
+      </w:r>
+      <w:proofErr w:type="spellEnd"/>
+      <w:r>
+        <w:rPr>
+          <w:lang w:val="es-ES_tradnl"/>
+        </w:rPr>
+        <w:t xml:space="preserve"> BUTTON3_MODULES[] = {3, 4, 5, 0};</w:t>
+      </w:r>
+      <w:r>
+        <w:rPr>
+          <w:lang w:val="es-ES_tradnl"/>
+        </w:rPr>
+        <w:t xml:space="preserve">” en el master para manejar grupos distintos en el master y en el cliente remoto </w:t>
       </w:r>
     </w:p>
     <w:p>

</xml_diff>

<commit_message>
todo ok con la version 1
</commit_message>
<xml_diff>
--- a/seniales_wifi_v1/Señales Wifi v1.docx
+++ b/seniales_wifi_v1/Señales Wifi v1.docx
@@ -382,7 +382,14 @@
         <w:rPr>
           <w:lang w:val="es-ES_tradnl"/>
         </w:rPr>
-        <w:t xml:space="preserve">otros 3  </w:t>
+        <w:t xml:space="preserve">otros </w:t>
+      </w:r>
+      <w:proofErr w:type="gramStart"/>
+      <w:r>
+        <w:rPr>
+          <w:lang w:val="es-ES_tradnl"/>
+        </w:rPr>
+        <w:t xml:space="preserve">3  </w:t>
       </w:r>
       <w:proofErr w:type="spellStart"/>
       <w:r>
@@ -392,6 +399,7 @@
         <w:t>modulos</w:t>
       </w:r>
       <w:proofErr w:type="spellEnd"/>
+      <w:proofErr w:type="gramEnd"/>
       <w:r>
         <w:rPr>
           <w:lang w:val="es-ES_tradnl"/>
@@ -424,13 +432,247 @@
         <w:rPr>
           <w:lang w:val="es-ES_tradnl"/>
         </w:rPr>
-        <w:t xml:space="preserve"> BUTTON3_MODULES[] = {3, 4, 5, 0};</w:t>
-      </w:r>
-      <w:r>
-        <w:rPr>
-          <w:lang w:val="es-ES_tradnl"/>
-        </w:rPr>
-        <w:t xml:space="preserve">” en el master para manejar grupos distintos en el master y en el cliente remoto </w:t>
+        <w:t xml:space="preserve"> BUTTON3_</w:t>
+      </w:r>
+      <w:proofErr w:type="gramStart"/>
+      <w:r>
+        <w:rPr>
+          <w:lang w:val="es-ES_tradnl"/>
+        </w:rPr>
+        <w:t>MODULES[</w:t>
+      </w:r>
+      <w:proofErr w:type="gramEnd"/>
+      <w:r>
+        <w:rPr>
+          <w:lang w:val="es-ES_tradnl"/>
+        </w:rPr>
+        <w:t>] = {3, 4, 5, 0};</w:t>
+      </w:r>
+      <w:r>
+        <w:rPr>
+          <w:lang w:val="es-ES_tradnl"/>
+        </w:rPr>
+        <w:t xml:space="preserve">” en el </w:t>
+      </w:r>
+      <w:proofErr w:type="gramStart"/>
+      <w:r>
+        <w:rPr>
+          <w:lang w:val="es-ES_tradnl"/>
+        </w:rPr>
+        <w:t>master</w:t>
+      </w:r>
+      <w:proofErr w:type="gramEnd"/>
+      <w:r>
+        <w:rPr>
+          <w:lang w:val="es-ES_tradnl"/>
+        </w:rPr>
+        <w:t xml:space="preserve"> para manejar grupos distintos en el </w:t>
+      </w:r>
+      <w:proofErr w:type="gramStart"/>
+      <w:r>
+        <w:rPr>
+          <w:lang w:val="es-ES_tradnl"/>
+        </w:rPr>
+        <w:t>master</w:t>
+      </w:r>
+      <w:proofErr w:type="gramEnd"/>
+      <w:r>
+        <w:rPr>
+          <w:lang w:val="es-ES_tradnl"/>
+        </w:rPr>
+        <w:t xml:space="preserve"> y en el cliente remoto </w:t>
+      </w:r>
+    </w:p>
+    <w:p>
+      <w:pPr>
+        <w:rPr>
+          <w:lang w:val="es-ES_tradnl"/>
+        </w:rPr>
+      </w:pPr>
+      <w:r>
+        <w:rPr>
+          <w:lang w:val="es-ES_tradnl"/>
+        </w:rPr>
+        <w:br w:type="page"/>
+      </w:r>
+    </w:p>
+    <w:p>
+      <w:pPr>
+        <w:rPr>
+          <w:lang w:val="es-ES_tradnl"/>
+        </w:rPr>
+      </w:pPr>
+      <w:r>
+        <w:rPr>
+          <w:lang w:val="es-ES_tradnl"/>
+        </w:rPr>
+        <w:lastRenderedPageBreak/>
+        <w:t>Bicicletas</w:t>
+      </w:r>
+    </w:p>
+    <w:p>
+      <w:pPr>
+        <w:rPr>
+          <w:lang w:val="es-ES_tradnl"/>
+        </w:rPr>
+      </w:pPr>
+    </w:p>
+    <w:p>
+      <w:pPr>
+        <w:pStyle w:val="NormalWeb"/>
+      </w:pPr>
+      <w:r>
+        <w:t>ajusta el codigo para que la tira este apagada al iniciar el programa, debe contar con un boton, al presionar el boton por primera vez</w:t>
+      </w:r>
+      <w:r>
+        <w:t xml:space="preserve"> debe prender en color blanco e ir cambiando de color a rojo al llegar a las 5 pulsasiones del boton, despues debe ir cambiando de rojo a amarillo de la pulsasion 6 a la 10 y de la 11 a la 15 a verde</w:t>
+      </w:r>
+    </w:p>
+    <w:p>
+      <w:pPr>
+        <w:pStyle w:val="NormalWeb"/>
+      </w:pPr>
+    </w:p>
+    <w:p>
+      <w:pPr>
+        <w:pStyle w:val="NormalWeb"/>
+      </w:pPr>
+      <w:r>
+        <w:rPr>
+          <w:rFonts w:ascii="Segoe UI" w:hAnsi="Segoe UI" w:cs="Segoe UI"/>
+          <w:color w:val="FAF9F5"/>
+          <w:spacing w:val="-6"/>
+          <w:sz w:val="23"/>
+          <w:szCs w:val="23"/>
+          <w:shd w:val="clear" w:color="auto" w:fill="141413"/>
+        </w:rPr>
+        <w:t>agrega un demo inicial al proyecto, y genera alguna animacion en los leds en ese demo, el demo se desactiva cuando se haga la primer pulsacion del boton, si no se recibe pulsacion del boton por 5 segundos, se debe activar el demo</w:t>
+      </w:r>
+    </w:p>
+    <w:p>
+      <w:pPr>
+        <w:rPr>
+          <w:lang w:val="es-ES_tradnl"/>
+        </w:rPr>
+      </w:pPr>
+      <w:proofErr w:type="spellStart"/>
+      <w:r>
+        <w:rPr>
+          <w:lang w:val="es-ES_tradnl"/>
+        </w:rPr>
+        <w:t>agraga</w:t>
+      </w:r>
+      <w:proofErr w:type="spellEnd"/>
+      <w:r>
+        <w:rPr>
+          <w:lang w:val="es-ES_tradnl"/>
+        </w:rPr>
+        <w:t xml:space="preserve"> </w:t>
+      </w:r>
+      <w:proofErr w:type="spellStart"/>
+      <w:r>
+        <w:rPr>
+          <w:lang w:val="es-ES_tradnl"/>
+        </w:rPr>
+        <w:t>algun</w:t>
+      </w:r>
+      <w:proofErr w:type="spellEnd"/>
+      <w:r>
+        <w:rPr>
+          <w:lang w:val="es-ES_tradnl"/>
+        </w:rPr>
+        <w:t xml:space="preserve"> efecto durante las </w:t>
+      </w:r>
+      <w:proofErr w:type="spellStart"/>
+      <w:r>
+        <w:rPr>
+          <w:lang w:val="es-ES_tradnl"/>
+        </w:rPr>
+        <w:t>transciones</w:t>
+      </w:r>
+      <w:proofErr w:type="spellEnd"/>
+      <w:r>
+        <w:rPr>
+          <w:lang w:val="es-ES_tradnl"/>
+        </w:rPr>
+        <w:t xml:space="preserve"> de colores en las etapas para que no se vea tan </w:t>
+      </w:r>
+      <w:proofErr w:type="spellStart"/>
+      <w:r>
+        <w:rPr>
+          <w:lang w:val="es-ES_tradnl"/>
+        </w:rPr>
+        <w:t>estatico</w:t>
+      </w:r>
+      <w:proofErr w:type="spellEnd"/>
+      <w:r>
+        <w:rPr>
+          <w:lang w:val="es-ES_tradnl"/>
+        </w:rPr>
+        <w:t xml:space="preserve"> el color</w:t>
+      </w:r>
+    </w:p>
+    <w:p>
+      <w:pPr>
+        <w:rPr>
+          <w:lang w:val="es-ES_tradnl"/>
+        </w:rPr>
+      </w:pPr>
+    </w:p>
+    <w:p>
+      <w:pPr>
+        <w:rPr>
+          <w:lang w:val="es-ES_tradnl"/>
+        </w:rPr>
+      </w:pPr>
+    </w:p>
+    <w:p>
+      <w:pPr>
+        <w:rPr>
+          <w:lang w:val="es-ES_tradnl"/>
+        </w:rPr>
+      </w:pPr>
+      <w:r>
+        <w:rPr>
+          <w:lang w:val="es-ES_tradnl"/>
+        </w:rPr>
+        <w:t xml:space="preserve">ajusta para que el </w:t>
+      </w:r>
+      <w:proofErr w:type="spellStart"/>
+      <w:r>
+        <w:rPr>
+          <w:lang w:val="es-ES_tradnl"/>
+        </w:rPr>
+        <w:t>camnbio</w:t>
+      </w:r>
+      <w:proofErr w:type="spellEnd"/>
+      <w:r>
+        <w:rPr>
+          <w:lang w:val="es-ES_tradnl"/>
+        </w:rPr>
+        <w:t xml:space="preserve"> de las transiciones vaya del blanco al color definido, también cambias el tiempo de </w:t>
+      </w:r>
+      <w:proofErr w:type="spellStart"/>
+      <w:r>
+        <w:rPr>
+          <w:lang w:val="es-ES_tradnl"/>
+        </w:rPr>
+        <w:t>iactividad</w:t>
+      </w:r>
+      <w:proofErr w:type="spellEnd"/>
+      <w:r>
+        <w:rPr>
+          <w:lang w:val="es-ES_tradnl"/>
+        </w:rPr>
+        <w:t xml:space="preserve"> a 10 segundos para iniciar el demo</w:t>
+      </w:r>
+    </w:p>
+    <w:p>
+      <w:pPr>
+        <w:pStyle w:val="NormalWeb"/>
+      </w:pPr>
+      <w:r>
+        <w:t>al pulso 30 no reinicies la funcionalidad, deja el ultimo color por 10 segundos como una funcion de ganador, despues de los 10 segundos ahora si reinicia todo, esa funcion de ganador debe tener un efecto de respiracion</w:t>
       </w:r>
     </w:p>
     <w:p>

</xml_diff>

<commit_message>
Parece que ahora sin esta jalando el Router externo
</commit_message>
<xml_diff>
--- a/seniales_wifi_v1/Señales Wifi v1.docx
+++ b/seniales_wifi_v1/Señales Wifi v1.docx
@@ -681,6 +681,165 @@
           <w:lang w:val="es-ES_tradnl"/>
         </w:rPr>
       </w:pPr>
+      <w:r>
+        <w:rPr>
+          <w:lang w:val="es-ES_tradnl"/>
+        </w:rPr>
+        <w:t xml:space="preserve">mi IP: </w:t>
+      </w:r>
+      <w:r>
+        <w:rPr>
+          <w:lang w:val="es-ES_tradnl"/>
+        </w:rPr>
+        <w:t>192.168.0.101</w:t>
+      </w:r>
+    </w:p>
+    <w:p>
+      <w:pPr>
+        <w:rPr>
+          <w:lang w:val="es-ES_tradnl"/>
+        </w:rPr>
+      </w:pPr>
+    </w:p>
+    <w:p>
+      <w:pPr>
+        <w:rPr>
+          <w:lang w:val="es-ES_tradnl"/>
+        </w:rPr>
+      </w:pPr>
+      <w:proofErr w:type="spellStart"/>
+      <w:r>
+        <w:rPr>
+          <w:lang w:val="es-ES_tradnl"/>
+        </w:rPr>
+        <w:t>const</w:t>
+      </w:r>
+      <w:proofErr w:type="spellEnd"/>
+      <w:r>
+        <w:rPr>
+          <w:lang w:val="es-ES_tradnl"/>
+        </w:rPr>
+        <w:t xml:space="preserve"> </w:t>
+      </w:r>
+      <w:proofErr w:type="spellStart"/>
+      <w:r>
+        <w:rPr>
+          <w:lang w:val="es-ES_tradnl"/>
+        </w:rPr>
+        <w:t>char</w:t>
+      </w:r>
+      <w:proofErr w:type="spellEnd"/>
+      <w:r>
+        <w:rPr>
+          <w:lang w:val="es-ES_tradnl"/>
+        </w:rPr>
+        <w:t>* ROUTER_SSID = "</w:t>
+      </w:r>
+      <w:proofErr w:type="spellStart"/>
+      <w:r>
+        <w:rPr>
+          <w:lang w:val="es-ES_tradnl"/>
+        </w:rPr>
+        <w:t>pmn_seniales</w:t>
+      </w:r>
+      <w:proofErr w:type="spellEnd"/>
+      <w:proofErr w:type="gramStart"/>
+      <w:r>
+        <w:rPr>
+          <w:lang w:val="es-ES_tradnl"/>
+        </w:rPr>
+        <w:t xml:space="preserve">";   </w:t>
+      </w:r>
+      <w:proofErr w:type="gramEnd"/>
+      <w:r>
+        <w:rPr>
+          <w:lang w:val="es-ES_tradnl"/>
+        </w:rPr>
+        <w:t xml:space="preserve">    // CAMBIAR! Nombre de tu </w:t>
+      </w:r>
+      <w:proofErr w:type="spellStart"/>
+      <w:r>
+        <w:rPr>
+          <w:lang w:val="es-ES_tradnl"/>
+        </w:rPr>
+        <w:t>WiFi</w:t>
+      </w:r>
+      <w:proofErr w:type="spellEnd"/>
+    </w:p>
+    <w:p>
+      <w:pPr>
+        <w:rPr>
+          <w:lang w:val="es-ES_tradnl"/>
+        </w:rPr>
+      </w:pPr>
+      <w:proofErr w:type="spellStart"/>
+      <w:r>
+        <w:rPr>
+          <w:lang w:val="es-ES_tradnl"/>
+        </w:rPr>
+        <w:t>const</w:t>
+      </w:r>
+      <w:proofErr w:type="spellEnd"/>
+      <w:r>
+        <w:rPr>
+          <w:lang w:val="es-ES_tradnl"/>
+        </w:rPr>
+        <w:t xml:space="preserve"> </w:t>
+      </w:r>
+      <w:proofErr w:type="spellStart"/>
+      <w:r>
+        <w:rPr>
+          <w:lang w:val="es-ES_tradnl"/>
+        </w:rPr>
+        <w:t>char</w:t>
+      </w:r>
+      <w:proofErr w:type="spellEnd"/>
+      <w:r>
+        <w:rPr>
+          <w:lang w:val="es-ES_tradnl"/>
+        </w:rPr>
+        <w:t>* ROUTER_PASS = "2WC456403581";</w:t>
+      </w:r>
+    </w:p>
+    <w:p>
+      <w:pPr>
+        <w:rPr>
+          <w:lang w:val="es-ES_tradnl"/>
+        </w:rPr>
+      </w:pPr>
+    </w:p>
+    <w:p>
+      <w:pPr>
+        <w:rPr>
+          <w:lang w:val="es-ES_tradnl"/>
+        </w:rPr>
+      </w:pPr>
+      <w:r>
+        <w:rPr>
+          <w:lang w:val="es-ES_tradnl"/>
+        </w:rPr>
+        <w:t xml:space="preserve">Contraseña </w:t>
+      </w:r>
+      <w:proofErr w:type="spellStart"/>
+      <w:r>
+        <w:rPr>
+          <w:lang w:val="es-ES_tradnl"/>
+        </w:rPr>
+        <w:t>Router</w:t>
+      </w:r>
+      <w:proofErr w:type="spellEnd"/>
+      <w:r>
+        <w:rPr>
+          <w:lang w:val="es-ES_tradnl"/>
+        </w:rPr>
+        <w:t xml:space="preserve"> RSV: </w:t>
+      </w:r>
+      <w:r>
+        <w:rPr>
+          <w:lang w:val="es-ES_tradnl"/>
+        </w:rPr>
+        <w:t>2WC456403581</w:t>
+      </w:r>
     </w:p>
     <w:sectPr>
       <w:pgSz w:w="12240" w:h="15840"/>

</xml_diff>

<commit_message>
ajustes nuevo router modulos  y master
</commit_message>
<xml_diff>
--- a/seniales_wifi_v1/Señales Wifi v1.docx
+++ b/seniales_wifi_v1/Señales Wifi v1.docx
@@ -854,6 +854,34 @@
           <w:lang w:val="es-ES_tradnl"/>
         </w:rPr>
       </w:pPr>
+      <w:r>
+        <w:rPr>
+          <w:lang w:val="es-ES_tradnl"/>
+        </w:rPr>
+        <w:br w:type="page"/>
+      </w:r>
+    </w:p>
+    <w:p>
+      <w:pPr>
+        <w:rPr>
+          <w:lang w:val="es-ES_tradnl"/>
+        </w:rPr>
+      </w:pPr>
+      <w:r>
+        <w:rPr>
+          <w:lang w:val="es-ES_tradnl"/>
+        </w:rPr>
+        <w:lastRenderedPageBreak/>
+        <w:t xml:space="preserve">B </w:t>
+      </w:r>
+      <w:proofErr w:type="spellStart"/>
+      <w:r>
+        <w:rPr>
+          <w:lang w:val="es-ES_tradnl"/>
+        </w:rPr>
+        <w:t>ici</w:t>
+      </w:r>
+      <w:proofErr w:type="spellEnd"/>
     </w:p>
     <w:sectPr>
       <w:pgSz w:w="12240" w:h="15840"/>

</xml_diff>